<commit_message>
Remove control-group framing: single-group design (no control group)
The study has no control group. Reframe the T-CAR PV adaptation as a
single-group pre->post change (overall dz=+0.93) in the aerobic article and
the dashboard physical section, dropping the Experimental/Control contrast,
and note the single-group/no-control design as a limitation.

Co-Authored-By: Claude Opus 4.8 <noreply@anthropic.com>
Claude-Session: https://claude.ai/code/session_01P7yGiDeoGDyjWvPWQVsUrj
</commit_message>
<xml_diff>
--- a/Artigos/Artigo_Aerobio_Humor.docx
+++ b/Artigos/Artigo_Aerobio_Humor.docx
@@ -40,7 +40,7 @@
           <w:i w:val="0"/>
           <w:sz w:val="24"/>
         </w:rPr>
-        <w:t>Objetivo: examinar a relação entre a capacidade aeróbia máxima, indexada pelo pico de velocidade (PV) no teste de Carminatti (T-CAR), e o perfil de humor de atletas de handebol de elite ao longo de um microciclo de pré-temporada, e descrever a adaptação da aptidão ao período. Métodos: estudo observacional com 24 atletas na avaliação física (capacidade aeróbia, potência de salto e capacidade de sprints repetidos, pré e pós-microciclo) e 25 atletas com humor diário (Escala de Humor de Brunel, seis dimensões). A associação entre o PV e a média semanal de cada dimensão do humor foi estimada por correlação de Spearman, com intervalos de confiança por reamostragem (bootstrap) e correção de multiplicidade por taxa de falsas descobertas (BH-FDR). Resultados: a capacidade aeróbia aumentou ao longo do microciclo (PV 14,88 → 15,66 km/h; dz = 0,93), com efeito grande no grupo experimental (dz = 2,82). Atletas com maior PV apresentaram menor fadiga física (ρ = -0,54; p = 0,005; sobrevivente à correção FDR) e maior vigor (ρ = +0,48; p = 0,015); as dimensões afetivas negativas não se associaram à aptidão. Conclusão: a capacidade aeróbia máxima comporta-se como um moderador da fadiga do microciclo, especificamente no eixo energia–fadiga; o mais apto tolera melhor a carga, fadigando menos e preservando o vigor.</w:t>
+        <w:t>Objetivo: examinar a relação entre a capacidade aeróbia máxima, indexada pelo pico de velocidade (PV) no teste de Carminatti (T-CAR), e o perfil de humor de atletas de handebol de elite ao longo de um microciclo de pré-temporada, e descrever a adaptação da aptidão ao período. Métodos: estudo observacional com 24 atletas na avaliação física (capacidade aeróbia, potência de salto e capacidade de sprints repetidos, pré e pós-microciclo) e 25 atletas com humor diário (Escala de Humor de Brunel, seis dimensões). A associação entre o PV e a média semanal de cada dimensão do humor foi estimada por correlação de Spearman, com intervalos de confiança por reamostragem (bootstrap) e correção de multiplicidade por taxa de falsas descobertas (BH-FDR). Resultados: a capacidade aeróbia aumentou ao longo do microciclo (PV 14,88 → 15,66 km/h; dz = 0,93, efeito grande). Atletas com maior PV apresentaram menor fadiga física (ρ = -0,54; p = 0,005; sobrevivente à correção FDR) e maior vigor (ρ = +0,48; p = 0,015); as dimensões afetivas negativas não se associaram à aptidão. Conclusão: a capacidade aeróbia máxima comporta-se como um moderador da fadiga do microciclo, especificamente no eixo energia–fadiga; o mais apto tolera melhor a carga, fadigando menos e preservando o vigor.</w:t>
       </w:r>
     </w:p>
     <w:p>
@@ -287,7 +287,7 @@
           <w:i w:val="0"/>
           <w:sz w:val="24"/>
         </w:rPr>
-        <w:t>A capacidade aeróbia máxima aumentou ao longo do microciclo: o PV passou de 14,88 para 15,66 km/h (dz = 0,93; Figura 1), com efeito grande no grupo experimental (dz = 2,82) e trivial no controle (dz = 0,23). Também houve melhora do salto vertical (CMJ, dz = 0,47) e da capacidade de sprints repetidos (Baker soma, dz = -1,08), o que confirma que o período induziu adaptação, sobretudo aeróbia.</w:t>
+        <w:t>A capacidade aeróbia máxima aumentou ao longo do microciclo: o PV passou de 14,88 para 15,66 km/h (dz = 0,93, efeito grande; Figura 1), na amostra como um todo. Também houve melhora do salto vertical (CMJ, dz = 0,47) e da capacidade de sprints repetidos (Baker soma, dz = -1,08), o que indica que o período foi acompanhado de adaptação, sobretudo aeróbia. Por se tratar de um desenho de grupo único, sem grupo controle, essa evolução é descrita como uma mudança observada no período, sem atribuição causal exclusiva ao treinamento.</w:t>
       </w:r>
     </w:p>
     <w:p>
@@ -339,7 +339,7 @@
           <w:rFonts w:ascii="Times New Roman" w:hAnsi="Times New Roman"/>
           <w:sz w:val="21"/>
         </w:rPr>
-        <w:t>Figura 1 – Adaptação da capacidade aeróbia máxima (pico de velocidade no T-CAR) do pré ao pós-microciclo, por grupo. Linhas finas: atletas; linhas grossas: média do grupo.</w:t>
+        <w:t>Figura 1 – Adaptação da capacidade aeróbia máxima (pico de velocidade no T-CAR) do pré ao pós-microciclo (grupo único). Linhas finas: atletas; linha grossa: média da amostra.</w:t>
       </w:r>
     </w:p>
     <w:p>
@@ -1209,7 +1209,7 @@
           <w:i w:val="0"/>
           <w:sz w:val="24"/>
         </w:rPr>
-        <w:t>Do ponto de vista aplicado, o pico de velocidade no T-CAR — medida de campo simples e de baixo custo — identifica atletas mais vulneráveis à fadiga do microciclo, permitindo individualizar a prescrição e a recuperação. Como o estímulo intervalado costuma ser prescrito em relação à velocidade de pico individual, o custo interno é relativo à aptidão de cada atleta, o que ajuda a explicar por que a vulnerabilidade à fadiga da semana se associa a um traço aeróbio prévio, e não à intensidade absoluta corrida. As principais limitações são o tamanho amostral, próprio de um elenco de elite, e o desenho observacional, que impõe cautela causal; a convergência com a adaptação aeróbia objetiva do período, contudo, dá plausibilidade à interpretação.</w:t>
+        <w:t>Do ponto de vista aplicado, o pico de velocidade no T-CAR — medida de campo simples e de baixo custo — identifica atletas mais vulneráveis à fadiga do microciclo, permitindo individualizar a prescrição e a recuperação. Como o estímulo intervalado costuma ser prescrito em relação à velocidade de pico individual, o custo interno é relativo à aptidão de cada atleta, o que ajuda a explicar por que a vulnerabilidade à fadiga da semana se associa a um traço aeróbio prévio, e não à intensidade absoluta corrida. As principais limitações são o tamanho amostral, próprio de um elenco de elite, e o desenho observacional de grupo único, sem grupo controle, que impõe cautela causal; a convergência com a adaptação aeróbia objetiva do período, contudo, dá plausibilidade à interpretação.</w:t>
       </w:r>
     </w:p>
     <w:p>

</xml_diff>